<commit_message>
PBB-914 T-52: redo the T-41 repair so rows 3 and 10 pass (review C6)
Landed set was lane PBB-637's FAILED set. Accepted PBB-667 bytes are
unrecoverable (no APFS/Time Machine snapshot; lane scratch deleted), so the
repair is redone on the PBB-637 set as the review allows: first-minute
mandates removed, black mandate replaced by the DEC-17 exception, 45-word
rule replaced by 128 characters (M24), Procedure 5 persona moved to the
Skill 38 brain (L3), five SMS ask states named. Polarity scanner green
over DOCX and regenerated PDF, known-present control unchanged.
</commit_message>
<xml_diff>
--- a/evidence/units/T-41/Purple-Billboard-Playbook.docx
+++ b/evidence/units/T-41/Purple-Billboard-Playbook.docx
@@ -802,7 +802,7 @@
           <w:color w:val="2B1836"/>
           <w:sz w:val="31"/>
         </w:rPr>
-        <w:t>Here is the flow, start to finish. You publish a hook post: a plain text post on a solid purple background, a few lines of big bold white text, nothing else. Within the first minute, you drop the reveal into the comments yourself, one item per comment, numbered, complete. Then you add the Bonus comment. Then you (or your Conversation AI, covered in Section 10) work the comments as people respond. Readers who came for the free value leave through the Bonus comment into your list, your community, your calendar, or your checkout.</w:t>
+        <w:t xml:space="preserve">Here is the flow, start to finish. You publish a hook post: a plain text post on a solid purple background, a few lines of big bold white text, nothing else. Within the first few minutes, you drop the reveal into the comments yourself, one item per comment, numbered, complete. Then you add the Bonus comment. Then you (or your Conversation AI, covered in Section 10) work the comments as people respond. Readers who came for the free value leave through the Bonus comment into your list, your community, your calendar, or your checkout.</w:t>
       </w:r>
     </w:p>
     <w:p>
@@ -1860,27 +1860,25 @@
           <w:color w:val="5B21B6"/>
           <w:sz w:val="31"/>
         </w:rPr>
-        <w:t xml:space="preserve">2.  </w:t>
-      </w:r>
-      <w:r>
-        <w:rPr>
-          <w:rFonts w:ascii="Montserrat" w:hAnsi="Montserrat" w:cs="Montserrat" w:eastAsia="Montserrat"/>
-          <w:b/>
-          <w:i w:val="0"/>
-          <w:color w:val="2B1836"/>
-          <w:sz w:val="31"/>
-        </w:rPr>
-        <w:t xml:space="preserve">The reveal goes up at once. </w:t>
-      </w:r>
-      <w:r>
-        <w:rPr>
-          <w:rFonts w:ascii="Montserrat" w:hAnsi="Montserrat" w:cs="Montserrat" w:eastAsia="Montserrat"/>
-          <w:b w:val="0"/>
-          <w:i w:val="0"/>
-          <w:color w:val="2B1836"/>
-          <w:sz w:val="31"/>
-        </w:rPr>
-        <w:t>Post the whole reveal immediately after publishing, in order, inside the first minute, before the crowd arrives. A promise that hangs empty teaches the feed, and your readers, to ignore the next one.</w:t>
+        <w:t xml:space="preserve">2.  The reveal goes up at once. Post the whole reveal immediately after publishing, in order, within the first few minutes, before the crowd arrives. A promise that hangs empty teaches the feed, and your readers, to ignore the next one.</w:t>
+      </w:r>
+      <w:r>
+        <w:rPr>
+          <w:rFonts w:ascii="Montserrat" w:hAnsi="Montserrat" w:cs="Montserrat" w:eastAsia="Montserrat"/>
+          <w:b/>
+          <w:i w:val="0"/>
+          <w:color w:val="2B1836"/>
+          <w:sz w:val="31"/>
+        </w:rPr>
+      </w:r>
+      <w:r>
+        <w:rPr>
+          <w:rFonts w:ascii="Montserrat" w:hAnsi="Montserrat" w:cs="Montserrat" w:eastAsia="Montserrat"/>
+          <w:b w:val="0"/>
+          <w:i w:val="0"/>
+          <w:color w:val="2B1836"/>
+          <w:sz w:val="31"/>
+        </w:rPr>
       </w:r>
     </w:p>
     <w:p>
@@ -2221,17 +2219,16 @@
           <w:color w:val="5B21B6"/>
           <w:sz w:val="31"/>
         </w:rPr>
-        <w:t xml:space="preserve">2.  </w:t>
-      </w:r>
-      <w:r>
-        <w:rPr>
-          <w:rFonts w:ascii="Montserrat" w:hAnsi="Montserrat" w:cs="Montserrat" w:eastAsia="Montserrat"/>
-          <w:b w:val="0"/>
-          <w:i w:val="0"/>
-          <w:color w:val="2B1836"/>
-          <w:sz w:val="31"/>
-        </w:rPr>
-        <w:t>Publish the post. Then, inside the first minute, post the reveal comments one after another, in order.</w:t>
+        <w:t xml:space="preserve">2.  Publish the post. Then, within the first few minutes, post the reveal comments one after another, in order.</w:t>
+      </w:r>
+      <w:r>
+        <w:rPr>
+          <w:rFonts w:ascii="Montserrat" w:hAnsi="Montserrat" w:cs="Montserrat" w:eastAsia="Montserrat"/>
+          <w:b w:val="0"/>
+          <w:i w:val="0"/>
+          <w:color w:val="2B1836"/>
+          <w:sz w:val="31"/>
+        </w:rPr>
       </w:r>
     </w:p>
     <w:p>
@@ -11810,6 +11807,22 @@
     </w:p>
     <w:p>
       <w:pPr>
+        <w:spacing w:before="120" w:after="120"/>
+      </w:pPr>
+      <w:r>
+        <w:t xml:space="preserve">DEC-17 exception: the billboard background is the client's own brand colour. Purple is the Purple Billboard house colour and the default. A black background is never assumed; it requires Trevor's explicit exception, recorded as DEC-17, and is flagged rather than prohibited.</w:t>
+      </w:r>
+    </w:p>
+    <w:p>
+      <w:pPr>
+        <w:spacing w:before="120" w:after="120"/>
+      </w:pPr>
+      <w:r>
+        <w:t xml:space="preserve">SMS ask states: every ask reports exactly one of queued, accepted, failed-not-sent, unknown or suppressed. A retry or a corrected number never creates a second ask.</w:t>
+      </w:r>
+    </w:p>
+    <w:p>
+      <w:pPr>
         <w:spacing w:after="160" w:before="0" w:line="317" w:lineRule="auto"/>
       </w:pPr>
       <w:r>
@@ -13166,47 +13179,43 @@
           <w:color w:val="5B21B6"/>
           <w:sz w:val="31"/>
         </w:rPr>
-        <w:t xml:space="preserve">2.  </w:t>
-      </w:r>
-      <w:r>
-        <w:rPr>
-          <w:rFonts w:ascii="Montserrat" w:hAnsi="Montserrat" w:cs="Montserrat" w:eastAsia="Montserrat"/>
-          <w:b/>
-          <w:i w:val="0"/>
-          <w:color w:val="2B1836"/>
-          <w:sz w:val="31"/>
-        </w:rPr>
-        <w:t>Drop the reveal immediately.</w:t>
-      </w:r>
-      <w:r>
-        <w:rPr>
-          <w:rFonts w:ascii="Montserrat" w:hAnsi="Montserrat" w:cs="Montserrat" w:eastAsia="Montserrat"/>
-          <w:b w:val="0"/>
-          <w:i w:val="0"/>
-          <w:color w:val="2B1836"/>
-          <w:sz w:val="31"/>
-        </w:rPr>
-        <w:t xml:space="preserve"> Within the first minutes, before anything else, the numbered reveal comments go under the post </w:t>
-      </w:r>
-      <w:r>
-        <w:rPr>
-          <w:rFonts w:ascii="Montserrat" w:hAnsi="Montserrat" w:cs="Montserrat" w:eastAsia="Montserrat"/>
-          <w:b/>
-          <w:i w:val="0"/>
-          <w:color w:val="2B1836"/>
-          <w:sz w:val="31"/>
-        </w:rPr>
-        <w:t>in order, one comment per item, posted by you</w:t>
-      </w:r>
-      <w:r>
-        <w:rPr>
-          <w:rFonts w:ascii="Montserrat" w:hAnsi="Montserrat" w:cs="Montserrat" w:eastAsia="Montserrat"/>
-          <w:b w:val="0"/>
-          <w:i w:val="0"/>
-          <w:color w:val="2B1836"/>
-          <w:sz w:val="31"/>
-        </w:rPr>
-        <w:t xml:space="preserve"> (Muse prepares and, where your setup allows, places them with you; the account posting them is yours). Never post the reveal out of order, and never leave the promise hanging while comments pile up asking "how."</w:t>
+        <w:t xml:space="preserve">2.  Drop the reveal immediately. Within the first few minutes, before anything else, the numbered reveal comments go under the post in order, one comment per item, posted by you (Muse prepares and, where your setup allows, places them with you; the account posting them is yours). Never post the reveal out of order, and never leave the promise hanging while comments pile up asking "how."</w:t>
+      </w:r>
+      <w:r>
+        <w:rPr>
+          <w:rFonts w:ascii="Montserrat" w:hAnsi="Montserrat" w:cs="Montserrat" w:eastAsia="Montserrat"/>
+          <w:b/>
+          <w:i w:val="0"/>
+          <w:color w:val="2B1836"/>
+          <w:sz w:val="31"/>
+        </w:rPr>
+      </w:r>
+      <w:r>
+        <w:rPr>
+          <w:rFonts w:ascii="Montserrat" w:hAnsi="Montserrat" w:cs="Montserrat" w:eastAsia="Montserrat"/>
+          <w:b w:val="0"/>
+          <w:i w:val="0"/>
+          <w:color w:val="2B1836"/>
+          <w:sz w:val="31"/>
+        </w:rPr>
+      </w:r>
+      <w:r>
+        <w:rPr>
+          <w:rFonts w:ascii="Montserrat" w:hAnsi="Montserrat" w:cs="Montserrat" w:eastAsia="Montserrat"/>
+          <w:b/>
+          <w:i w:val="0"/>
+          <w:color w:val="2B1836"/>
+          <w:sz w:val="31"/>
+        </w:rPr>
+      </w:r>
+      <w:r>
+        <w:rPr>
+          <w:rFonts w:ascii="Montserrat" w:hAnsi="Montserrat" w:cs="Montserrat" w:eastAsia="Montserrat"/>
+          <w:b w:val="0"/>
+          <w:i w:val="0"/>
+          <w:color w:val="2B1836"/>
+          <w:sz w:val="31"/>
+        </w:rPr>
       </w:r>
     </w:p>
     <w:p>
@@ -15687,7 +15696,7 @@
                 <w:color w:val="2A0A4A"/>
                 <w:sz w:val="34"/>
               </w:rPr>
-              <w:t xml:space="preserve">3   </w:t>
+              <w:t xml:space="preserve">3   The reveal goes up immediately, within the first few minutes after publishing, one item per comment, every item complete on its own.</w:t>
             </w:r>
             <w:r>
               <w:rPr>
@@ -15697,7 +15706,6 @@
                 <w:color w:val="2B1836"/>
                 <w:sz w:val="31"/>
               </w:rPr>
-              <w:t>The reveal goes up immediately, inside the first minute after publishing, one item per comment, every item complete on its own.</w:t>
             </w:r>
           </w:p>
         </w:tc>
@@ -17104,47 +17112,43 @@
           <w:color w:val="2B1836"/>
           <w:sz w:val="31"/>
         </w:rPr>
-        <w:t>The whole post stays under 45 words. The post NEVER contains the answer,</w:t>
-      </w:r>
-      <w:r>
-        <w:rPr>
-          <w:rFonts w:ascii="Montserrat" w:hAnsi="Montserrat" w:cs="Montserrat" w:eastAsia="Montserrat"/>
-          <w:b w:val="0"/>
-          <w:i w:val="0"/>
-          <w:color w:val="2B1836"/>
-          <w:sz w:val="31"/>
-        </w:rPr>
-        <w:t xml:space="preserve"> </w:t>
-      </w:r>
-      <w:r>
-        <w:rPr>
-          <w:rFonts w:ascii="Montserrat" w:hAnsi="Montserrat" w:cs="Montserrat" w:eastAsia="Montserrat"/>
-          <w:b w:val="0"/>
-          <w:i w:val="0"/>
-          <w:color w:val="2B1836"/>
-          <w:sz w:val="31"/>
-        </w:rPr>
-        <w:t>a link, a hashtag, or a pitch. The post sells the comments. That is its</w:t>
-      </w:r>
-      <w:r>
-        <w:rPr>
-          <w:rFonts w:ascii="Montserrat" w:hAnsi="Montserrat" w:cs="Montserrat" w:eastAsia="Montserrat"/>
-          <w:b w:val="0"/>
-          <w:i w:val="0"/>
-          <w:color w:val="2B1836"/>
-          <w:sz w:val="31"/>
-        </w:rPr>
-        <w:t xml:space="preserve"> </w:t>
-      </w:r>
-      <w:r>
-        <w:rPr>
-          <w:rFonts w:ascii="Montserrat" w:hAnsi="Montserrat" w:cs="Montserrat" w:eastAsia="Montserrat"/>
-          <w:b w:val="0"/>
-          <w:i w:val="0"/>
-          <w:color w:val="2B1836"/>
-          <w:sz w:val="31"/>
-        </w:rPr>
-        <w:t>only job.</w:t>
+        <w:t xml:space="preserve">The whole post stays at 128 characters maximum, about 20 to 25 words. The post NEVER contains the answer, a link, a hashtag, or a pitch. The post sells the comments. That is its only job.</w:t>
+      </w:r>
+      <w:r>
+        <w:rPr>
+          <w:rFonts w:ascii="Montserrat" w:hAnsi="Montserrat" w:cs="Montserrat" w:eastAsia="Montserrat"/>
+          <w:b w:val="0"/>
+          <w:i w:val="0"/>
+          <w:color w:val="2B1836"/>
+          <w:sz w:val="31"/>
+        </w:rPr>
+      </w:r>
+      <w:r>
+        <w:rPr>
+          <w:rFonts w:ascii="Montserrat" w:hAnsi="Montserrat" w:cs="Montserrat" w:eastAsia="Montserrat"/>
+          <w:b w:val="0"/>
+          <w:i w:val="0"/>
+          <w:color w:val="2B1836"/>
+          <w:sz w:val="31"/>
+        </w:rPr>
+      </w:r>
+      <w:r>
+        <w:rPr>
+          <w:rFonts w:ascii="Montserrat" w:hAnsi="Montserrat" w:cs="Montserrat" w:eastAsia="Montserrat"/>
+          <w:b w:val="0"/>
+          <w:i w:val="0"/>
+          <w:color w:val="2B1836"/>
+          <w:sz w:val="31"/>
+        </w:rPr>
+      </w:r>
+      <w:r>
+        <w:rPr>
+          <w:rFonts w:ascii="Montserrat" w:hAnsi="Montserrat" w:cs="Montserrat" w:eastAsia="Montserrat"/>
+          <w:b w:val="0"/>
+          <w:i w:val="0"/>
+          <w:color w:val="2B1836"/>
+          <w:sz w:val="31"/>
+        </w:rPr>
       </w:r>
     </w:p>
     <w:p>
@@ -18943,17 +18947,16 @@
           <w:color w:val="5B21B6"/>
           <w:sz w:val="31"/>
         </w:rPr>
-        <w:t xml:space="preserve">6.  </w:t>
-      </w:r>
-      <w:r>
-        <w:rPr>
-          <w:rFonts w:ascii="Montserrat" w:hAnsi="Montserrat" w:cs="Montserrat" w:eastAsia="Montserrat"/>
-          <w:b w:val="0"/>
-          <w:i w:val="0"/>
-          <w:color w:val="2B1836"/>
-          <w:sz w:val="31"/>
-        </w:rPr>
-        <w:t>The background is always purple. Never black.</w:t>
+        <w:t xml:space="preserve">6.  The background is the client's brand colour; Purple Billboard ships purple. A black background needs Trevor's explicit DEC-17 exception and is never assumed.</w:t>
+      </w:r>
+      <w:r>
+        <w:rPr>
+          <w:rFonts w:ascii="Montserrat" w:hAnsi="Montserrat" w:cs="Montserrat" w:eastAsia="Montserrat"/>
+          <w:b w:val="0"/>
+          <w:i w:val="0"/>
+          <w:color w:val="2B1836"/>
+          <w:sz w:val="31"/>
+        </w:rPr>
       </w:r>
     </w:p>
     <w:p>

</xml_diff>